<commit_message>
Week 5 HOL4 completed
</commit_message>
<xml_diff>
--- a/Week5/Module 9 - React/Module 9 output.docx
+++ b/Week5/Module 9 - React/Module 9 output.docx
@@ -47,8 +47,9 @@
       <w:r>
         <w:rPr>
           <w:b/>
-          <w:sz w:val="36"/>
-          <w:lang w:val="en-US"/>
+          <w:noProof/>
+          <w:sz w:val="36"/>
+          <w:lang w:eastAsia="en-IN"/>
         </w:rPr>
         <w:drawing>
           <wp:inline distT="0" distB="0" distL="0" distR="0" wp14:anchorId="1958FAF0" wp14:editId="53EB6701">
@@ -98,8 +99,9 @@
       <w:r>
         <w:rPr>
           <w:b/>
-          <w:sz w:val="36"/>
-          <w:lang w:val="en-US"/>
+          <w:noProof/>
+          <w:sz w:val="36"/>
+          <w:lang w:eastAsia="en-IN"/>
         </w:rPr>
         <w:drawing>
           <wp:inline distT="0" distB="0" distL="0" distR="0" wp14:anchorId="5344A696" wp14:editId="4A3CEEC7">
@@ -183,8 +185,9 @@
       <w:r>
         <w:rPr>
           <w:b/>
-          <w:sz w:val="36"/>
-          <w:lang w:val="en-US"/>
+          <w:noProof/>
+          <w:sz w:val="36"/>
+          <w:lang w:eastAsia="en-IN"/>
         </w:rPr>
         <w:drawing>
           <wp:inline distT="0" distB="0" distL="0" distR="0" wp14:anchorId="73735EB2" wp14:editId="4C5A4B97">
@@ -258,7 +261,8 @@
       <w:r>
         <w:rPr>
           <w:b/>
-          <w:lang w:val="en-US"/>
+          <w:noProof/>
+          <w:lang w:eastAsia="en-IN"/>
         </w:rPr>
         <w:drawing>
           <wp:inline distT="0" distB="0" distL="0" distR="0" wp14:anchorId="7146512E" wp14:editId="2A957A2D">
@@ -322,7 +326,8 @@
       <w:r>
         <w:rPr>
           <w:b/>
-          <w:lang w:val="en-US"/>
+          <w:noProof/>
+          <w:lang w:eastAsia="en-IN"/>
         </w:rPr>
         <w:drawing>
           <wp:inline distT="0" distB="0" distL="0" distR="0" wp14:anchorId="4C1EB505" wp14:editId="6EF6EBC9">
@@ -386,7 +391,8 @@
       <w:r>
         <w:rPr>
           <w:b/>
-          <w:lang w:val="en-US"/>
+          <w:noProof/>
+          <w:lang w:eastAsia="en-IN"/>
         </w:rPr>
         <w:drawing>
           <wp:inline distT="0" distB="0" distL="0" distR="0" wp14:anchorId="6077D781" wp14:editId="70935131">
@@ -467,7 +473,8 @@
       <w:r>
         <w:rPr>
           <w:b/>
-          <w:lang w:val="en-US"/>
+          <w:noProof/>
+          <w:lang w:eastAsia="en-IN"/>
         </w:rPr>
         <w:drawing>
           <wp:inline distT="0" distB="0" distL="0" distR="0" wp14:anchorId="66E342B8" wp14:editId="47AAF1E0">
@@ -551,8 +558,9 @@
       <w:r>
         <w:rPr>
           <w:b/>
-          <w:sz w:val="36"/>
-          <w:lang w:val="en-US"/>
+          <w:noProof/>
+          <w:sz w:val="36"/>
+          <w:lang w:eastAsia="en-IN"/>
         </w:rPr>
         <w:drawing>
           <wp:inline distT="0" distB="0" distL="0" distR="0" wp14:anchorId="3C1DC5F6" wp14:editId="051F1671">
@@ -619,8 +627,9 @@
       <w:r>
         <w:rPr>
           <w:b/>
-          <w:sz w:val="36"/>
-          <w:lang w:val="en-US"/>
+          <w:noProof/>
+          <w:sz w:val="36"/>
+          <w:lang w:eastAsia="en-IN"/>
         </w:rPr>
         <w:drawing>
           <wp:inline distT="0" distB="0" distL="0" distR="0" wp14:anchorId="445E7766" wp14:editId="771757AC">
@@ -688,8 +697,9 @@
       <w:r>
         <w:rPr>
           <w:b/>
-          <w:sz w:val="36"/>
-          <w:lang w:val="en-US"/>
+          <w:noProof/>
+          <w:sz w:val="36"/>
+          <w:lang w:eastAsia="en-IN"/>
         </w:rPr>
         <w:drawing>
           <wp:inline distT="0" distB="0" distL="0" distR="0" wp14:anchorId="47BCAD0D" wp14:editId="54EC285F">
@@ -756,8 +766,9 @@
       <w:r>
         <w:rPr>
           <w:b/>
-          <w:sz w:val="36"/>
-          <w:lang w:val="en-US"/>
+          <w:noProof/>
+          <w:sz w:val="36"/>
+          <w:lang w:eastAsia="en-IN"/>
         </w:rPr>
         <w:drawing>
           <wp:inline distT="0" distB="0" distL="0" distR="0" wp14:anchorId="50C27D0F" wp14:editId="0FD4318E">
@@ -801,6 +812,418 @@
         <w:rPr>
           <w:b/>
           <w:sz w:val="36"/>
+          <w:lang w:val="en-US"/>
+        </w:rPr>
+      </w:pPr>
+    </w:p>
+    <w:p>
+      <w:pPr>
+        <w:rPr>
+          <w:b/>
+          <w:sz w:val="36"/>
+          <w:lang w:val="en-US"/>
+        </w:rPr>
+      </w:pPr>
+      <w:r>
+        <w:rPr>
+          <w:b/>
+          <w:sz w:val="36"/>
+          <w:lang w:val="en-US"/>
+        </w:rPr>
+        <w:lastRenderedPageBreak/>
+        <w:t>HOL4</w:t>
+      </w:r>
+    </w:p>
+    <w:p>
+      <w:pPr>
+        <w:rPr>
+          <w:b/>
+          <w:sz w:val="24"/>
+          <w:szCs w:val="24"/>
+          <w:lang w:val="en-US"/>
+        </w:rPr>
+      </w:pPr>
+      <w:r>
+        <w:rPr>
+          <w:b/>
+          <w:sz w:val="24"/>
+          <w:szCs w:val="24"/>
+          <w:lang w:val="en-US"/>
+        </w:rPr>
+        <w:t>Post.js</w:t>
+      </w:r>
+    </w:p>
+    <w:p>
+      <w:pPr>
+        <w:rPr>
+          <w:b/>
+          <w:sz w:val="36"/>
+          <w:lang w:val="en-US"/>
+        </w:rPr>
+      </w:pPr>
+      <w:r>
+        <w:rPr>
+          <w:b/>
+          <w:sz w:val="36"/>
+          <w:lang w:val="en-US"/>
+        </w:rPr>
+        <w:drawing>
+          <wp:inline distT="0" distB="0" distL="0" distR="0" wp14:anchorId="71D7AA37" wp14:editId="06F03E31">
+            <wp:extent cx="4033205" cy="1905000"/>
+            <wp:effectExtent l="0" t="0" r="5715" b="0"/>
+            <wp:docPr id="12" name="Picture 12"/>
+            <wp:cNvGraphicFramePr>
+              <a:graphicFrameLocks xmlns:a="http://schemas.openxmlformats.org/drawingml/2006/main" noChangeAspect="1"/>
+            </wp:cNvGraphicFramePr>
+            <a:graphic xmlns:a="http://schemas.openxmlformats.org/drawingml/2006/main">
+              <a:graphicData uri="http://schemas.openxmlformats.org/drawingml/2006/picture">
+                <pic:pic xmlns:pic="http://schemas.openxmlformats.org/drawingml/2006/picture">
+                  <pic:nvPicPr>
+                    <pic:cNvPr id="0" name=""/>
+                    <pic:cNvPicPr/>
+                  </pic:nvPicPr>
+                  <pic:blipFill>
+                    <a:blip r:embed="rId16"/>
+                    <a:stretch>
+                      <a:fillRect/>
+                    </a:stretch>
+                  </pic:blipFill>
+                  <pic:spPr>
+                    <a:xfrm>
+                      <a:off x="0" y="0"/>
+                      <a:ext cx="4036275" cy="1906450"/>
+                    </a:xfrm>
+                    <a:prstGeom prst="rect">
+                      <a:avLst/>
+                    </a:prstGeom>
+                  </pic:spPr>
+                </pic:pic>
+              </a:graphicData>
+            </a:graphic>
+          </wp:inline>
+        </w:drawing>
+      </w:r>
+    </w:p>
+    <w:p>
+      <w:pPr>
+        <w:rPr>
+          <w:b/>
+          <w:sz w:val="24"/>
+          <w:szCs w:val="24"/>
+          <w:lang w:val="en-US"/>
+        </w:rPr>
+      </w:pPr>
+      <w:r>
+        <w:rPr>
+          <w:b/>
+          <w:sz w:val="24"/>
+          <w:szCs w:val="24"/>
+          <w:lang w:val="en-US"/>
+        </w:rPr>
+        <w:t>Posts.js</w:t>
+      </w:r>
+    </w:p>
+    <w:p>
+      <w:pPr>
+        <w:rPr>
+          <w:b/>
+          <w:sz w:val="36"/>
+          <w:lang w:val="en-US"/>
+        </w:rPr>
+      </w:pPr>
+      <w:r>
+        <w:rPr>
+          <w:b/>
+          <w:sz w:val="36"/>
+          <w:lang w:val="en-US"/>
+        </w:rPr>
+        <w:drawing>
+          <wp:inline distT="0" distB="0" distL="0" distR="0" wp14:anchorId="79B05E4C" wp14:editId="5F4A6F3D">
+            <wp:extent cx="3764280" cy="2711408"/>
+            <wp:effectExtent l="0" t="0" r="7620" b="0"/>
+            <wp:docPr id="13" name="Picture 13"/>
+            <wp:cNvGraphicFramePr>
+              <a:graphicFrameLocks xmlns:a="http://schemas.openxmlformats.org/drawingml/2006/main" noChangeAspect="1"/>
+            </wp:cNvGraphicFramePr>
+            <a:graphic xmlns:a="http://schemas.openxmlformats.org/drawingml/2006/main">
+              <a:graphicData uri="http://schemas.openxmlformats.org/drawingml/2006/picture">
+                <pic:pic xmlns:pic="http://schemas.openxmlformats.org/drawingml/2006/picture">
+                  <pic:nvPicPr>
+                    <pic:cNvPr id="0" name=""/>
+                    <pic:cNvPicPr/>
+                  </pic:nvPicPr>
+                  <pic:blipFill>
+                    <a:blip r:embed="rId17"/>
+                    <a:stretch>
+                      <a:fillRect/>
+                    </a:stretch>
+                  </pic:blipFill>
+                  <pic:spPr>
+                    <a:xfrm>
+                      <a:off x="0" y="0"/>
+                      <a:ext cx="3768165" cy="2714206"/>
+                    </a:xfrm>
+                    <a:prstGeom prst="rect">
+                      <a:avLst/>
+                    </a:prstGeom>
+                  </pic:spPr>
+                </pic:pic>
+              </a:graphicData>
+            </a:graphic>
+          </wp:inline>
+        </w:drawing>
+      </w:r>
+    </w:p>
+    <w:p>
+      <w:pPr>
+        <w:rPr>
+          <w:b/>
+          <w:sz w:val="24"/>
+          <w:szCs w:val="24"/>
+          <w:lang w:val="en-US"/>
+        </w:rPr>
+      </w:pPr>
+      <w:r>
+        <w:rPr>
+          <w:b/>
+          <w:sz w:val="24"/>
+          <w:szCs w:val="24"/>
+          <w:lang w:val="en-US"/>
+        </w:rPr>
+        <w:t>App.js</w:t>
+      </w:r>
+    </w:p>
+    <w:p>
+      <w:pPr>
+        <w:rPr>
+          <w:b/>
+          <w:sz w:val="36"/>
+          <w:lang w:val="en-US"/>
+        </w:rPr>
+      </w:pPr>
+      <w:r>
+        <w:rPr>
+          <w:b/>
+          <w:sz w:val="36"/>
+          <w:lang w:val="en-US"/>
+        </w:rPr>
+        <w:drawing>
+          <wp:inline distT="0" distB="0" distL="0" distR="0" wp14:anchorId="635275E8" wp14:editId="6D823B97">
+            <wp:extent cx="2654132" cy="2011680"/>
+            <wp:effectExtent l="0" t="0" r="0" b="7620"/>
+            <wp:docPr id="14" name="Picture 14"/>
+            <wp:cNvGraphicFramePr>
+              <a:graphicFrameLocks xmlns:a="http://schemas.openxmlformats.org/drawingml/2006/main" noChangeAspect="1"/>
+            </wp:cNvGraphicFramePr>
+            <a:graphic xmlns:a="http://schemas.openxmlformats.org/drawingml/2006/main">
+              <a:graphicData uri="http://schemas.openxmlformats.org/drawingml/2006/picture">
+                <pic:pic xmlns:pic="http://schemas.openxmlformats.org/drawingml/2006/picture">
+                  <pic:nvPicPr>
+                    <pic:cNvPr id="0" name=""/>
+                    <pic:cNvPicPr/>
+                  </pic:nvPicPr>
+                  <pic:blipFill>
+                    <a:blip r:embed="rId18"/>
+                    <a:stretch>
+                      <a:fillRect/>
+                    </a:stretch>
+                  </pic:blipFill>
+                  <pic:spPr>
+                    <a:xfrm>
+                      <a:off x="0" y="0"/>
+                      <a:ext cx="2654789" cy="2012178"/>
+                    </a:xfrm>
+                    <a:prstGeom prst="rect">
+                      <a:avLst/>
+                    </a:prstGeom>
+                  </pic:spPr>
+                </pic:pic>
+              </a:graphicData>
+            </a:graphic>
+          </wp:inline>
+        </w:drawing>
+      </w:r>
+    </w:p>
+    <w:p>
+      <w:pPr>
+        <w:rPr>
+          <w:b/>
+          <w:sz w:val="24"/>
+          <w:szCs w:val="24"/>
+          <w:lang w:val="en-US"/>
+        </w:rPr>
+      </w:pPr>
+    </w:p>
+    <w:p>
+      <w:pPr>
+        <w:rPr>
+          <w:b/>
+          <w:sz w:val="24"/>
+          <w:szCs w:val="24"/>
+          <w:lang w:val="en-US"/>
+        </w:rPr>
+      </w:pPr>
+      <w:r>
+        <w:rPr>
+          <w:b/>
+          <w:sz w:val="24"/>
+          <w:szCs w:val="24"/>
+          <w:lang w:val="en-US"/>
+        </w:rPr>
+        <w:lastRenderedPageBreak/>
+        <w:t>Index.js</w:t>
+      </w:r>
+    </w:p>
+    <w:p>
+      <w:pPr>
+        <w:rPr>
+          <w:b/>
+          <w:sz w:val="24"/>
+          <w:szCs w:val="24"/>
+          <w:lang w:val="en-US"/>
+        </w:rPr>
+      </w:pPr>
+      <w:r>
+        <w:rPr>
+          <w:b/>
+          <w:sz w:val="24"/>
+          <w:szCs w:val="24"/>
+          <w:lang w:val="en-US"/>
+        </w:rPr>
+        <w:drawing>
+          <wp:inline distT="0" distB="0" distL="0" distR="0" wp14:anchorId="048344F6" wp14:editId="0A3A0878">
+            <wp:extent cx="3484197" cy="1699260"/>
+            <wp:effectExtent l="0" t="0" r="2540" b="0"/>
+            <wp:docPr id="15" name="Picture 15"/>
+            <wp:cNvGraphicFramePr>
+              <a:graphicFrameLocks xmlns:a="http://schemas.openxmlformats.org/drawingml/2006/main" noChangeAspect="1"/>
+            </wp:cNvGraphicFramePr>
+            <a:graphic xmlns:a="http://schemas.openxmlformats.org/drawingml/2006/main">
+              <a:graphicData uri="http://schemas.openxmlformats.org/drawingml/2006/picture">
+                <pic:pic xmlns:pic="http://schemas.openxmlformats.org/drawingml/2006/picture">
+                  <pic:nvPicPr>
+                    <pic:cNvPr id="0" name=""/>
+                    <pic:cNvPicPr/>
+                  </pic:nvPicPr>
+                  <pic:blipFill>
+                    <a:blip r:embed="rId19"/>
+                    <a:stretch>
+                      <a:fillRect/>
+                    </a:stretch>
+                  </pic:blipFill>
+                  <pic:spPr>
+                    <a:xfrm>
+                      <a:off x="0" y="0"/>
+                      <a:ext cx="3484499" cy="1699407"/>
+                    </a:xfrm>
+                    <a:prstGeom prst="rect">
+                      <a:avLst/>
+                    </a:prstGeom>
+                  </pic:spPr>
+                </pic:pic>
+              </a:graphicData>
+            </a:graphic>
+          </wp:inline>
+        </w:drawing>
+      </w:r>
+    </w:p>
+    <w:p>
+      <w:pPr>
+        <w:rPr>
+          <w:b/>
+          <w:sz w:val="24"/>
+          <w:szCs w:val="24"/>
+          <w:lang w:val="en-US"/>
+        </w:rPr>
+      </w:pPr>
+      <w:r>
+        <w:rPr>
+          <w:b/>
+          <w:sz w:val="24"/>
+          <w:szCs w:val="24"/>
+          <w:lang w:val="en-US"/>
+        </w:rPr>
+        <w:t>Output</w:t>
+      </w:r>
+    </w:p>
+    <w:p>
+      <w:pPr>
+        <w:rPr>
+          <w:b/>
+          <w:sz w:val="24"/>
+          <w:szCs w:val="24"/>
+          <w:lang w:val="en-US"/>
+        </w:rPr>
+      </w:pPr>
+      <w:r>
+        <w:rPr>
+          <w:b/>
+          <w:sz w:val="24"/>
+          <w:szCs w:val="24"/>
+          <w:lang w:val="en-US"/>
+        </w:rPr>
+        <w:drawing>
+          <wp:inline distT="0" distB="0" distL="0" distR="0" wp14:anchorId="2D00FEB2" wp14:editId="6654A912">
+            <wp:extent cx="5731510" cy="3020065"/>
+            <wp:effectExtent l="0" t="0" r="2540" b="8890"/>
+            <wp:docPr id="16" name="Picture 16"/>
+            <wp:cNvGraphicFramePr>
+              <a:graphicFrameLocks xmlns:a="http://schemas.openxmlformats.org/drawingml/2006/main" noChangeAspect="1"/>
+            </wp:cNvGraphicFramePr>
+            <a:graphic xmlns:a="http://schemas.openxmlformats.org/drawingml/2006/main">
+              <a:graphicData uri="http://schemas.openxmlformats.org/drawingml/2006/picture">
+                <pic:pic xmlns:pic="http://schemas.openxmlformats.org/drawingml/2006/picture">
+                  <pic:nvPicPr>
+                    <pic:cNvPr id="0" name=""/>
+                    <pic:cNvPicPr/>
+                  </pic:nvPicPr>
+                  <pic:blipFill>
+                    <a:blip r:embed="rId20"/>
+                    <a:stretch>
+                      <a:fillRect/>
+                    </a:stretch>
+                  </pic:blipFill>
+                  <pic:spPr>
+                    <a:xfrm>
+                      <a:off x="0" y="0"/>
+                      <a:ext cx="5731510" cy="3020065"/>
+                    </a:xfrm>
+                    <a:prstGeom prst="rect">
+                      <a:avLst/>
+                    </a:prstGeom>
+                  </pic:spPr>
+                </pic:pic>
+              </a:graphicData>
+            </a:graphic>
+          </wp:inline>
+        </w:drawing>
+      </w:r>
+    </w:p>
+    <w:p>
+      <w:pPr>
+        <w:rPr>
+          <w:b/>
+          <w:sz w:val="36"/>
+          <w:szCs w:val="36"/>
+          <w:lang w:val="en-US"/>
+        </w:rPr>
+      </w:pPr>
+      <w:r>
+        <w:rPr>
+          <w:b/>
+          <w:sz w:val="36"/>
+          <w:szCs w:val="36"/>
+          <w:lang w:val="en-US"/>
+        </w:rPr>
+        <w:t>HOL5</w:t>
+      </w:r>
+    </w:p>
+    <w:p>
+      <w:pPr>
+        <w:rPr>
+          <w:b/>
+          <w:sz w:val="36"/>
+          <w:szCs w:val="36"/>
           <w:lang w:val="en-US"/>
         </w:rPr>
       </w:pPr>

</xml_diff>

<commit_message>
Week 5 HOL5 completed
</commit_message>
<xml_diff>
--- a/Week5/Module 9 - React/Module 9 output.docx
+++ b/Week5/Module 9 - React/Module 9 output.docx
@@ -1227,6 +1227,156 @@
           <w:lang w:val="en-US"/>
         </w:rPr>
       </w:pPr>
+      <w:r>
+        <w:rPr>
+          <w:b/>
+          <w:sz w:val="36"/>
+          <w:szCs w:val="36"/>
+          <w:lang w:val="en-US"/>
+        </w:rPr>
+        <w:drawing>
+          <wp:inline distT="0" distB="0" distL="0" distR="0" wp14:anchorId="0E5FDB5A" wp14:editId="383C09F2">
+            <wp:extent cx="5288280" cy="2605720"/>
+            <wp:effectExtent l="0" t="0" r="7620" b="4445"/>
+            <wp:docPr id="17" name="Picture 17"/>
+            <wp:cNvGraphicFramePr>
+              <a:graphicFrameLocks xmlns:a="http://schemas.openxmlformats.org/drawingml/2006/main" noChangeAspect="1"/>
+            </wp:cNvGraphicFramePr>
+            <a:graphic xmlns:a="http://schemas.openxmlformats.org/drawingml/2006/main">
+              <a:graphicData uri="http://schemas.openxmlformats.org/drawingml/2006/picture">
+                <pic:pic xmlns:pic="http://schemas.openxmlformats.org/drawingml/2006/picture">
+                  <pic:nvPicPr>
+                    <pic:cNvPr id="0" name=""/>
+                    <pic:cNvPicPr/>
+                  </pic:nvPicPr>
+                  <pic:blipFill>
+                    <a:blip r:embed="rId21"/>
+                    <a:stretch>
+                      <a:fillRect/>
+                    </a:stretch>
+                  </pic:blipFill>
+                  <pic:spPr>
+                    <a:xfrm>
+                      <a:off x="0" y="0"/>
+                      <a:ext cx="5286284" cy="2604736"/>
+                    </a:xfrm>
+                    <a:prstGeom prst="rect">
+                      <a:avLst/>
+                    </a:prstGeom>
+                  </pic:spPr>
+                </pic:pic>
+              </a:graphicData>
+            </a:graphic>
+          </wp:inline>
+        </w:drawing>
+      </w:r>
+    </w:p>
+    <w:p>
+      <w:pPr>
+        <w:rPr>
+          <w:b/>
+          <w:sz w:val="36"/>
+          <w:szCs w:val="36"/>
+          <w:lang w:val="en-US"/>
+        </w:rPr>
+      </w:pPr>
+      <w:r>
+        <w:rPr>
+          <w:b/>
+          <w:sz w:val="36"/>
+          <w:szCs w:val="36"/>
+          <w:lang w:val="en-US"/>
+        </w:rPr>
+        <w:lastRenderedPageBreak/>
+        <w:drawing>
+          <wp:inline distT="0" distB="0" distL="0" distR="0" wp14:anchorId="656077F7" wp14:editId="7D448398">
+            <wp:extent cx="3894450" cy="3436620"/>
+            <wp:effectExtent l="0" t="0" r="0" b="0"/>
+            <wp:docPr id="18" name="Picture 18"/>
+            <wp:cNvGraphicFramePr>
+              <a:graphicFrameLocks xmlns:a="http://schemas.openxmlformats.org/drawingml/2006/main" noChangeAspect="1"/>
+            </wp:cNvGraphicFramePr>
+            <a:graphic xmlns:a="http://schemas.openxmlformats.org/drawingml/2006/main">
+              <a:graphicData uri="http://schemas.openxmlformats.org/drawingml/2006/picture">
+                <pic:pic xmlns:pic="http://schemas.openxmlformats.org/drawingml/2006/picture">
+                  <pic:nvPicPr>
+                    <pic:cNvPr id="0" name=""/>
+                    <pic:cNvPicPr/>
+                  </pic:nvPicPr>
+                  <pic:blipFill>
+                    <a:blip r:embed="rId22"/>
+                    <a:stretch>
+                      <a:fillRect/>
+                    </a:stretch>
+                  </pic:blipFill>
+                  <pic:spPr>
+                    <a:xfrm>
+                      <a:off x="0" y="0"/>
+                      <a:ext cx="3894788" cy="3436918"/>
+                    </a:xfrm>
+                    <a:prstGeom prst="rect">
+                      <a:avLst/>
+                    </a:prstGeom>
+                  </pic:spPr>
+                </pic:pic>
+              </a:graphicData>
+            </a:graphic>
+          </wp:inline>
+        </w:drawing>
+      </w:r>
+    </w:p>
+    <w:p>
+      <w:pPr>
+        <w:rPr>
+          <w:b/>
+          <w:sz w:val="36"/>
+          <w:szCs w:val="36"/>
+          <w:lang w:val="en-US"/>
+        </w:rPr>
+      </w:pPr>
+      <w:r>
+        <w:rPr>
+          <w:b/>
+          <w:sz w:val="36"/>
+          <w:szCs w:val="36"/>
+          <w:lang w:val="en-US"/>
+        </w:rPr>
+        <w:drawing>
+          <wp:inline distT="0" distB="0" distL="0" distR="0" wp14:anchorId="7C8D4C2B" wp14:editId="37722746">
+            <wp:extent cx="5731510" cy="3040884"/>
+            <wp:effectExtent l="0" t="0" r="2540" b="7620"/>
+            <wp:docPr id="19" name="Picture 19"/>
+            <wp:cNvGraphicFramePr>
+              <a:graphicFrameLocks xmlns:a="http://schemas.openxmlformats.org/drawingml/2006/main" noChangeAspect="1"/>
+            </wp:cNvGraphicFramePr>
+            <a:graphic xmlns:a="http://schemas.openxmlformats.org/drawingml/2006/main">
+              <a:graphicData uri="http://schemas.openxmlformats.org/drawingml/2006/picture">
+                <pic:pic xmlns:pic="http://schemas.openxmlformats.org/drawingml/2006/picture">
+                  <pic:nvPicPr>
+                    <pic:cNvPr id="0" name=""/>
+                    <pic:cNvPicPr/>
+                  </pic:nvPicPr>
+                  <pic:blipFill>
+                    <a:blip r:embed="rId23"/>
+                    <a:stretch>
+                      <a:fillRect/>
+                    </a:stretch>
+                  </pic:blipFill>
+                  <pic:spPr>
+                    <a:xfrm>
+                      <a:off x="0" y="0"/>
+                      <a:ext cx="5731510" cy="3040884"/>
+                    </a:xfrm>
+                    <a:prstGeom prst="rect">
+                      <a:avLst/>
+                    </a:prstGeom>
+                  </pic:spPr>
+                </pic:pic>
+              </a:graphicData>
+            </a:graphic>
+          </wp:inline>
+        </w:drawing>
+      </w:r>
       <w:bookmarkStart w:id="0" w:name="_GoBack"/>
       <w:bookmarkEnd w:id="0"/>
     </w:p>

</xml_diff>